<commit_message>
Flag Partner LOB objects in DM-R1, DM-H and DM-T docs
Tag every hub / link / satellite that a Customer-Party domain row of the
partner Source-Target mapping targets with a bold "[Partner LOB]" marker.

Rule:
- OPUS docs matched against Partner_plus_KYC_SourceToModel_Mapping,
  MAXIMUS docs against Maximus_Partner_SourceToModel_Mapping.
- A name is flagged when it appears in Model Target on a row whose Domains
  include "Customer / Party".
- SAT_AUG_X is flagged when its standard twin SAT_X is flagged.

Marker placed in the Results summary table, the per-object Validation
Queries headings and the Satellite row of each detail table. SQL bodies
untouched.

Coverage: OPUS 37/59 objects, MAXIMUS 82/98 (DM-T also covers hubs/links:
OPUS 44/73, MAXIMUS 94/111).
</commit_message>
<xml_diff>
--- a/BGIL_DBT/validation/DM-H/DM-H2_OPUS.docx
+++ b/BGIL_DBT/validation/DM-H/DM-H2_OPUS.docx
@@ -575,6 +575,12 @@
             <w:r>
               <w:t xml:space="preserve">SAT_AGREEMENT_COMMERCIAL_TERMS</w:t>
             </w:r>
+            <w:r>
+              <w:rPr>
+                <w:b/>
+              </w:rPr>
+              <w:t xml:space="preserve"> [Partner LOB]</w:t>
+            </w:r>
           </w:p>
         </w:tc>
         <w:tc>
@@ -633,6 +639,12 @@
             <w:r>
               <w:t xml:space="preserve">SAT_AGREEMENT_DEFINITION</w:t>
             </w:r>
+            <w:r>
+              <w:rPr>
+                <w:b/>
+              </w:rPr>
+              <w:t xml:space="preserve"> [Partner LOB]</w:t>
+            </w:r>
           </w:p>
         </w:tc>
         <w:tc>
@@ -691,6 +703,12 @@
             <w:r>
               <w:t xml:space="preserve">SAT_COMMON_ADDRESS</w:t>
             </w:r>
+            <w:r>
+              <w:rPr>
+                <w:b/>
+              </w:rPr>
+              <w:t xml:space="preserve"> [Partner LOB]</w:t>
+            </w:r>
           </w:p>
         </w:tc>
         <w:tc>
@@ -807,6 +825,12 @@
             <w:r>
               <w:t xml:space="preserve">SAT_COMMON_CLASSIFICATION</w:t>
             </w:r>
+            <w:r>
+              <w:rPr>
+                <w:b/>
+              </w:rPr>
+              <w:t xml:space="preserve"> [Partner LOB]</w:t>
+            </w:r>
           </w:p>
         </w:tc>
         <w:tc>
@@ -865,6 +889,12 @@
             <w:r>
               <w:t xml:space="preserve">SAT_COMMON_COMMUNICATION_PREFERENCE</w:t>
             </w:r>
+            <w:r>
+              <w:rPr>
+                <w:b/>
+              </w:rPr>
+              <w:t xml:space="preserve"> [Partner LOB]</w:t>
+            </w:r>
           </w:p>
         </w:tc>
         <w:tc>
@@ -923,6 +953,12 @@
             <w:r>
               <w:t xml:space="preserve">SAT_COMMON_CONSENT</w:t>
             </w:r>
+            <w:r>
+              <w:rPr>
+                <w:b/>
+              </w:rPr>
+              <w:t xml:space="preserve"> [Partner LOB]</w:t>
+            </w:r>
           </w:p>
         </w:tc>
         <w:tc>
@@ -981,6 +1017,12 @@
             <w:r>
               <w:t xml:space="preserve">SAT_COMMON_CONTACT</w:t>
             </w:r>
+            <w:r>
+              <w:rPr>
+                <w:b/>
+              </w:rPr>
+              <w:t xml:space="preserve"> [Partner LOB]</w:t>
+            </w:r>
           </w:p>
         </w:tc>
         <w:tc>
@@ -1039,6 +1081,12 @@
             <w:r>
               <w:t xml:space="preserve">SAT_COMMON_GEO</w:t>
             </w:r>
+            <w:r>
+              <w:rPr>
+                <w:b/>
+              </w:rPr>
+              <w:t xml:space="preserve"> [Partner LOB]</w:t>
+            </w:r>
           </w:p>
         </w:tc>
         <w:tc>
@@ -1097,6 +1145,12 @@
             <w:r>
               <w:t xml:space="preserve">SAT_DOCUMENT_DEFINITION</w:t>
             </w:r>
+            <w:r>
+              <w:rPr>
+                <w:b/>
+              </w:rPr>
+              <w:t xml:space="preserve"> [Partner LOB]</w:t>
+            </w:r>
           </w:p>
         </w:tc>
         <w:tc>
@@ -1213,6 +1267,12 @@
             <w:r>
               <w:t xml:space="preserve">SAT_LNK_PARTY_ROLE_CORE</w:t>
             </w:r>
+            <w:r>
+              <w:rPr>
+                <w:b/>
+              </w:rPr>
+              <w:t xml:space="preserve"> [Partner LOB]</w:t>
+            </w:r>
           </w:p>
         </w:tc>
         <w:tc>
@@ -1271,6 +1331,12 @@
             <w:r>
               <w:t xml:space="preserve">SAT_LNK_POLICY_PARTY_ROLE</w:t>
             </w:r>
+            <w:r>
+              <w:rPr>
+                <w:b/>
+              </w:rPr>
+              <w:t xml:space="preserve"> [Partner LOB]</w:t>
+            </w:r>
           </w:p>
         </w:tc>
         <w:tc>
@@ -1329,6 +1395,12 @@
             <w:r>
               <w:t xml:space="preserve">SAT_LNK_ROLE_AGENT</w:t>
             </w:r>
+            <w:r>
+              <w:rPr>
+                <w:b/>
+              </w:rPr>
+              <w:t xml:space="preserve"> [Partner LOB]</w:t>
+            </w:r>
           </w:p>
         </w:tc>
         <w:tc>
@@ -1387,6 +1459,12 @@
             <w:r>
               <w:t xml:space="preserve">SAT_LNK_ROLE_CUSTOMER</w:t>
             </w:r>
+            <w:r>
+              <w:rPr>
+                <w:b/>
+              </w:rPr>
+              <w:t xml:space="preserve"> [Partner LOB]</w:t>
+            </w:r>
           </w:p>
         </w:tc>
         <w:tc>
@@ -1503,6 +1581,12 @@
             <w:r>
               <w:t xml:space="preserve">SAT_LNK_ROLE_PROVIDER</w:t>
             </w:r>
+            <w:r>
+              <w:rPr>
+                <w:b/>
+              </w:rPr>
+              <w:t xml:space="preserve"> [Partner LOB]</w:t>
+            </w:r>
           </w:p>
         </w:tc>
         <w:tc>
@@ -1561,6 +1645,12 @@
             <w:r>
               <w:t xml:space="preserve">SAT_LNK_ROLE_SURVEYOR</w:t>
             </w:r>
+            <w:r>
+              <w:rPr>
+                <w:b/>
+              </w:rPr>
+              <w:t xml:space="preserve"> [Partner LOB]</w:t>
+            </w:r>
           </w:p>
         </w:tc>
         <w:tc>
@@ -1619,6 +1709,12 @@
             <w:r>
               <w:t xml:space="preserve">SAT_PARTY_AML_SCREENING</w:t>
             </w:r>
+            <w:r>
+              <w:rPr>
+                <w:b/>
+              </w:rPr>
+              <w:t xml:space="preserve"> [Partner LOB]</w:t>
+            </w:r>
           </w:p>
         </w:tc>
         <w:tc>
@@ -1677,6 +1773,12 @@
             <w:r>
               <w:t xml:space="preserve">SAT_PARTY_BANKING</w:t>
             </w:r>
+            <w:r>
+              <w:rPr>
+                <w:b/>
+              </w:rPr>
+              <w:t xml:space="preserve"> [Partner LOB]</w:t>
+            </w:r>
           </w:p>
         </w:tc>
         <w:tc>
@@ -1793,6 +1895,12 @@
             <w:r>
               <w:t xml:space="preserve">SAT_PARTY_CONTACT_ADDRESS_LINK</w:t>
             </w:r>
+            <w:r>
+              <w:rPr>
+                <w:b/>
+              </w:rPr>
+              <w:t xml:space="preserve"> [Partner LOB]</w:t>
+            </w:r>
           </w:p>
         </w:tc>
         <w:tc>
@@ -1851,6 +1959,12 @@
             <w:r>
               <w:t xml:space="preserve">SAT_PARTY_EMPLOYMENT</w:t>
             </w:r>
+            <w:r>
+              <w:rPr>
+                <w:b/>
+              </w:rPr>
+              <w:t xml:space="preserve"> [Partner LOB]</w:t>
+            </w:r>
           </w:p>
         </w:tc>
         <w:tc>
@@ -1909,6 +2023,12 @@
             <w:r>
               <w:t xml:space="preserve">SAT_PARTY_GROUP_CENSUS</w:t>
             </w:r>
+            <w:r>
+              <w:rPr>
+                <w:b/>
+              </w:rPr>
+              <w:t xml:space="preserve"> [Partner LOB]</w:t>
+            </w:r>
           </w:p>
         </w:tc>
         <w:tc>
@@ -1967,6 +2087,12 @@
             <w:r>
               <w:t xml:space="preserve">SAT_PARTY_GROUP_HOUSEHOLD</w:t>
             </w:r>
+            <w:r>
+              <w:rPr>
+                <w:b/>
+              </w:rPr>
+              <w:t xml:space="preserve"> [Partner LOB]</w:t>
+            </w:r>
           </w:p>
         </w:tc>
         <w:tc>
@@ -2025,6 +2151,12 @@
             <w:r>
               <w:t xml:space="preserve">SAT_PARTY_HEALTH_PROFILE</w:t>
             </w:r>
+            <w:r>
+              <w:rPr>
+                <w:b/>
+              </w:rPr>
+              <w:t xml:space="preserve"> [Partner LOB]</w:t>
+            </w:r>
           </w:p>
         </w:tc>
         <w:tc>
@@ -2083,6 +2215,12 @@
             <w:r>
               <w:t xml:space="preserve">SAT_PARTY_IDENTIFICATION</w:t>
             </w:r>
+            <w:r>
+              <w:rPr>
+                <w:b/>
+              </w:rPr>
+              <w:t xml:space="preserve"> [Partner LOB]</w:t>
+            </w:r>
           </w:p>
         </w:tc>
         <w:tc>
@@ -2141,6 +2279,12 @@
             <w:r>
               <w:t xml:space="preserve">SAT_PARTY_IDENTITY</w:t>
             </w:r>
+            <w:r>
+              <w:rPr>
+                <w:b/>
+              </w:rPr>
+              <w:t xml:space="preserve"> [Partner LOB]</w:t>
+            </w:r>
           </w:p>
         </w:tc>
         <w:tc>
@@ -2199,6 +2343,12 @@
             <w:r>
               <w:t xml:space="preserve">SAT_PARTY_INDIVIDUAL_DEMOGRAPHICS</w:t>
             </w:r>
+            <w:r>
+              <w:rPr>
+                <w:b/>
+              </w:rPr>
+              <w:t xml:space="preserve"> [Partner LOB]</w:t>
+            </w:r>
           </w:p>
         </w:tc>
         <w:tc>
@@ -2257,6 +2407,12 @@
             <w:r>
               <w:t xml:space="preserve">SAT_PARTY_KYC</w:t>
             </w:r>
+            <w:r>
+              <w:rPr>
+                <w:b/>
+              </w:rPr>
+              <w:t xml:space="preserve"> [Partner LOB]</w:t>
+            </w:r>
           </w:p>
         </w:tc>
         <w:tc>
@@ -2315,6 +2471,12 @@
             <w:r>
               <w:t xml:space="preserve">SAT_PARTY_KYC_REFERENCE</w:t>
             </w:r>
+            <w:r>
+              <w:rPr>
+                <w:b/>
+              </w:rPr>
+              <w:t xml:space="preserve"> [Partner LOB]</w:t>
+            </w:r>
           </w:p>
         </w:tc>
         <w:tc>
@@ -2373,6 +2535,12 @@
             <w:r>
               <w:t xml:space="preserve">SAT_PARTY_ORGANISATION_PROFILE</w:t>
             </w:r>
+            <w:r>
+              <w:rPr>
+                <w:b/>
+              </w:rPr>
+              <w:t xml:space="preserve"> [Partner LOB]</w:t>
+            </w:r>
           </w:p>
         </w:tc>
         <w:tc>
@@ -2605,6 +2773,12 @@
             <w:r>
               <w:t xml:space="preserve">SAT_POLICY_CLASSIFICATION</w:t>
             </w:r>
+            <w:r>
+              <w:rPr>
+                <w:b/>
+              </w:rPr>
+              <w:t xml:space="preserve"> [Partner LOB]</w:t>
+            </w:r>
           </w:p>
         </w:tc>
         <w:tc>
@@ -2779,6 +2953,12 @@
             <w:r>
               <w:t xml:space="preserve">SAT_POLICY_HEADER</w:t>
             </w:r>
+            <w:r>
+              <w:rPr>
+                <w:b/>
+              </w:rPr>
+              <w:t xml:space="preserve"> [Partner LOB]</w:t>
+            </w:r>
           </w:p>
         </w:tc>
         <w:tc>
@@ -2895,6 +3075,12 @@
             <w:r>
               <w:t xml:space="preserve">SAT_POLICY_PREMIUM_SUMMARY</w:t>
             </w:r>
+            <w:r>
+              <w:rPr>
+                <w:b/>
+              </w:rPr>
+              <w:t xml:space="preserve"> [Partner LOB]</w:t>
+            </w:r>
           </w:p>
         </w:tc>
         <w:tc>
@@ -3011,6 +3197,12 @@
             <w:r>
               <w:t xml:space="preserve">SAT_PROVIDER_BANKING</w:t>
             </w:r>
+            <w:r>
+              <w:rPr>
+                <w:b/>
+              </w:rPr>
+              <w:t xml:space="preserve"> [Partner LOB]</w:t>
+            </w:r>
           </w:p>
         </w:tc>
         <w:tc>
@@ -3069,6 +3261,12 @@
             <w:r>
               <w:t xml:space="preserve">SAT_PROVIDER_TARIFF</w:t>
             </w:r>
+            <w:r>
+              <w:rPr>
+                <w:b/>
+              </w:rPr>
+              <w:t xml:space="preserve"> [Partner LOB]</w:t>
+            </w:r>
           </w:p>
         </w:tc>
         <w:tc>
@@ -3591,6 +3789,12 @@
             <w:r>
               <w:t xml:space="preserve">SAT_AUG_LNK_ROLE_AGENT</w:t>
             </w:r>
+            <w:r>
+              <w:rPr>
+                <w:b/>
+              </w:rPr>
+              <w:t xml:space="preserve"> [Partner LOB]</w:t>
+            </w:r>
           </w:p>
         </w:tc>
         <w:tc>
@@ -3649,6 +3853,12 @@
             <w:r>
               <w:t xml:space="preserve">SAT_AUG_LNK_ROLE_CUSTOMER</w:t>
             </w:r>
+            <w:r>
+              <w:rPr>
+                <w:b/>
+              </w:rPr>
+              <w:t xml:space="preserve"> [Partner LOB]</w:t>
+            </w:r>
           </w:p>
         </w:tc>
         <w:tc>
@@ -3707,6 +3917,12 @@
             <w:r>
               <w:t xml:space="preserve">SAT_AUG_LNK_ROLE_PROVIDER</w:t>
             </w:r>
+            <w:r>
+              <w:rPr>
+                <w:b/>
+              </w:rPr>
+              <w:t xml:space="preserve"> [Partner LOB]</w:t>
+            </w:r>
           </w:p>
         </w:tc>
         <w:tc>
@@ -3764,6 +3980,12 @@
           <w:p>
             <w:r>
               <w:t xml:space="preserve">SAT_AUG_LNK_ROLE_SURVEYOR</w:t>
+            </w:r>
+            <w:r>
+              <w:rPr>
+                <w:b/>
+              </w:rPr>
+              <w:t xml:space="preserve"> [Partner LOB]</w:t>
             </w:r>
           </w:p>
         </w:tc>
@@ -4043,6 +4265,12 @@
       <w:r>
         <w:t xml:space="preserve">1. OPUS — SAT_AGREEMENT_COMMERCIAL_TERMS</w:t>
       </w:r>
+      <w:r>
+        <w:rPr>
+          <w:b/>
+        </w:rPr>
+        <w:t xml:space="preserve"> [Partner LOB]</w:t>
+      </w:r>
     </w:p>
     <w:tbl>
       <w:tblPr>
@@ -4100,6 +4328,12 @@
           <w:p>
             <w:r>
               <w:t xml:space="preserve">SAT_AGREEMENT_COMMERCIAL_TERMS</w:t>
+            </w:r>
+            <w:r>
+              <w:rPr>
+                <w:b/>
+              </w:rPr>
+              <w:t xml:space="preserve"> [Partner LOB]</w:t>
             </w:r>
           </w:p>
         </w:tc>
@@ -4363,6 +4597,12 @@
       <w:r>
         <w:t xml:space="preserve">2. OPUS — SAT_AGREEMENT_DEFINITION</w:t>
       </w:r>
+      <w:r>
+        <w:rPr>
+          <w:b/>
+        </w:rPr>
+        <w:t xml:space="preserve"> [Partner LOB]</w:t>
+      </w:r>
     </w:p>
     <w:tbl>
       <w:tblPr>
@@ -4420,6 +4660,12 @@
           <w:p>
             <w:r>
               <w:t xml:space="preserve">SAT_AGREEMENT_DEFINITION</w:t>
+            </w:r>
+            <w:r>
+              <w:rPr>
+                <w:b/>
+              </w:rPr>
+              <w:t xml:space="preserve"> [Partner LOB]</w:t>
             </w:r>
           </w:p>
         </w:tc>
@@ -4683,6 +4929,12 @@
       <w:r>
         <w:t xml:space="preserve">3. OPUS — SAT_COMMON_ADDRESS</w:t>
       </w:r>
+      <w:r>
+        <w:rPr>
+          <w:b/>
+        </w:rPr>
+        <w:t xml:space="preserve"> [Partner LOB]</w:t>
+      </w:r>
     </w:p>
     <w:tbl>
       <w:tblPr>
@@ -4740,6 +4992,12 @@
           <w:p>
             <w:r>
               <w:t xml:space="preserve">SAT_COMMON_ADDRESS</w:t>
+            </w:r>
+            <w:r>
+              <w:rPr>
+                <w:b/>
+              </w:rPr>
+              <w:t xml:space="preserve"> [Partner LOB]</w:t>
             </w:r>
           </w:p>
         </w:tc>
@@ -5323,6 +5581,12 @@
       <w:r>
         <w:t xml:space="preserve">5. OPUS — SAT_COMMON_CLASSIFICATION</w:t>
       </w:r>
+      <w:r>
+        <w:rPr>
+          <w:b/>
+        </w:rPr>
+        <w:t xml:space="preserve"> [Partner LOB]</w:t>
+      </w:r>
     </w:p>
     <w:tbl>
       <w:tblPr>
@@ -5380,6 +5644,12 @@
           <w:p>
             <w:r>
               <w:t xml:space="preserve">SAT_COMMON_CLASSIFICATION</w:t>
+            </w:r>
+            <w:r>
+              <w:rPr>
+                <w:b/>
+              </w:rPr>
+              <w:t xml:space="preserve"> [Partner LOB]</w:t>
             </w:r>
           </w:p>
         </w:tc>
@@ -5643,6 +5913,12 @@
       <w:r>
         <w:t xml:space="preserve">6. OPUS — SAT_COMMON_COMMUNICATION_PREFERENCE</w:t>
       </w:r>
+      <w:r>
+        <w:rPr>
+          <w:b/>
+        </w:rPr>
+        <w:t xml:space="preserve"> [Partner LOB]</w:t>
+      </w:r>
     </w:p>
     <w:tbl>
       <w:tblPr>
@@ -5700,6 +5976,12 @@
           <w:p>
             <w:r>
               <w:t xml:space="preserve">SAT_COMMON_COMMUNICATION_PREFERENCE</w:t>
+            </w:r>
+            <w:r>
+              <w:rPr>
+                <w:b/>
+              </w:rPr>
+              <w:t xml:space="preserve"> [Partner LOB]</w:t>
             </w:r>
           </w:p>
         </w:tc>
@@ -5963,6 +6245,12 @@
       <w:r>
         <w:t xml:space="preserve">7. OPUS — SAT_COMMON_CONSENT</w:t>
       </w:r>
+      <w:r>
+        <w:rPr>
+          <w:b/>
+        </w:rPr>
+        <w:t xml:space="preserve"> [Partner LOB]</w:t>
+      </w:r>
     </w:p>
     <w:tbl>
       <w:tblPr>
@@ -6020,6 +6308,12 @@
           <w:p>
             <w:r>
               <w:t xml:space="preserve">SAT_COMMON_CONSENT</w:t>
+            </w:r>
+            <w:r>
+              <w:rPr>
+                <w:b/>
+              </w:rPr>
+              <w:t xml:space="preserve"> [Partner LOB]</w:t>
             </w:r>
           </w:p>
         </w:tc>
@@ -6283,6 +6577,12 @@
       <w:r>
         <w:t xml:space="preserve">8. OPUS — SAT_COMMON_CONTACT</w:t>
       </w:r>
+      <w:r>
+        <w:rPr>
+          <w:b/>
+        </w:rPr>
+        <w:t xml:space="preserve"> [Partner LOB]</w:t>
+      </w:r>
     </w:p>
     <w:tbl>
       <w:tblPr>
@@ -6340,6 +6640,12 @@
           <w:p>
             <w:r>
               <w:t xml:space="preserve">SAT_COMMON_CONTACT</w:t>
+            </w:r>
+            <w:r>
+              <w:rPr>
+                <w:b/>
+              </w:rPr>
+              <w:t xml:space="preserve"> [Partner LOB]</w:t>
             </w:r>
           </w:p>
         </w:tc>
@@ -6603,6 +6909,12 @@
       <w:r>
         <w:t xml:space="preserve">9. OPUS — SAT_COMMON_GEO</w:t>
       </w:r>
+      <w:r>
+        <w:rPr>
+          <w:b/>
+        </w:rPr>
+        <w:t xml:space="preserve"> [Partner LOB]</w:t>
+      </w:r>
     </w:p>
     <w:tbl>
       <w:tblPr>
@@ -6660,6 +6972,12 @@
           <w:p>
             <w:r>
               <w:t xml:space="preserve">SAT_COMMON_GEO</w:t>
+            </w:r>
+            <w:r>
+              <w:rPr>
+                <w:b/>
+              </w:rPr>
+              <w:t xml:space="preserve"> [Partner LOB]</w:t>
             </w:r>
           </w:p>
         </w:tc>
@@ -6923,6 +7241,12 @@
       <w:r>
         <w:t xml:space="preserve">10. OPUS — SAT_DOCUMENT_DEFINITION</w:t>
       </w:r>
+      <w:r>
+        <w:rPr>
+          <w:b/>
+        </w:rPr>
+        <w:t xml:space="preserve"> [Partner LOB]</w:t>
+      </w:r>
     </w:p>
     <w:tbl>
       <w:tblPr>
@@ -6980,6 +7304,12 @@
           <w:p>
             <w:r>
               <w:t xml:space="preserve">SAT_DOCUMENT_DEFINITION</w:t>
+            </w:r>
+            <w:r>
+              <w:rPr>
+                <w:b/>
+              </w:rPr>
+              <w:t xml:space="preserve"> [Partner LOB]</w:t>
             </w:r>
           </w:p>
         </w:tc>
@@ -7555,6 +7885,12 @@
       <w:r>
         <w:t xml:space="preserve">12. OPUS — SAT_LNK_PARTY_ROLE_CORE</w:t>
       </w:r>
+      <w:r>
+        <w:rPr>
+          <w:b/>
+        </w:rPr>
+        <w:t xml:space="preserve"> [Partner LOB]</w:t>
+      </w:r>
     </w:p>
     <w:tbl>
       <w:tblPr>
@@ -7612,6 +7948,12 @@
           <w:p>
             <w:r>
               <w:t xml:space="preserve">SAT_LNK_PARTY_ROLE_CORE</w:t>
+            </w:r>
+            <w:r>
+              <w:rPr>
+                <w:b/>
+              </w:rPr>
+              <w:t xml:space="preserve"> [Partner LOB]</w:t>
             </w:r>
           </w:p>
         </w:tc>
@@ -7867,6 +8209,12 @@
       <w:r>
         <w:t xml:space="preserve">13. OPUS — SAT_LNK_POLICY_PARTY_ROLE</w:t>
       </w:r>
+      <w:r>
+        <w:rPr>
+          <w:b/>
+        </w:rPr>
+        <w:t xml:space="preserve"> [Partner LOB]</w:t>
+      </w:r>
     </w:p>
     <w:tbl>
       <w:tblPr>
@@ -7924,6 +8272,12 @@
           <w:p>
             <w:r>
               <w:t xml:space="preserve">SAT_LNK_POLICY_PARTY_ROLE</w:t>
+            </w:r>
+            <w:r>
+              <w:rPr>
+                <w:b/>
+              </w:rPr>
+              <w:t xml:space="preserve"> [Partner LOB]</w:t>
             </w:r>
           </w:p>
         </w:tc>
@@ -8179,6 +8533,12 @@
       <w:r>
         <w:t xml:space="preserve">14. OPUS — SAT_LNK_ROLE_AGENT</w:t>
       </w:r>
+      <w:r>
+        <w:rPr>
+          <w:b/>
+        </w:rPr>
+        <w:t xml:space="preserve"> [Partner LOB]</w:t>
+      </w:r>
     </w:p>
     <w:tbl>
       <w:tblPr>
@@ -8236,6 +8596,12 @@
           <w:p>
             <w:r>
               <w:t xml:space="preserve">SAT_LNK_ROLE_AGENT</w:t>
+            </w:r>
+            <w:r>
+              <w:rPr>
+                <w:b/>
+              </w:rPr>
+              <w:t xml:space="preserve"> [Partner LOB]</w:t>
             </w:r>
           </w:p>
         </w:tc>
@@ -8499,6 +8865,12 @@
       <w:r>
         <w:t xml:space="preserve">15. OPUS — SAT_LNK_ROLE_CUSTOMER</w:t>
       </w:r>
+      <w:r>
+        <w:rPr>
+          <w:b/>
+        </w:rPr>
+        <w:t xml:space="preserve"> [Partner LOB]</w:t>
+      </w:r>
     </w:p>
     <w:tbl>
       <w:tblPr>
@@ -8556,6 +8928,12 @@
           <w:p>
             <w:r>
               <w:t xml:space="preserve">SAT_LNK_ROLE_CUSTOMER</w:t>
+            </w:r>
+            <w:r>
+              <w:rPr>
+                <w:b/>
+              </w:rPr>
+              <w:t xml:space="preserve"> [Partner LOB]</w:t>
             </w:r>
           </w:p>
         </w:tc>
@@ -9139,6 +9517,12 @@
       <w:r>
         <w:t xml:space="preserve">17. OPUS — SAT_LNK_ROLE_PROVIDER</w:t>
       </w:r>
+      <w:r>
+        <w:rPr>
+          <w:b/>
+        </w:rPr>
+        <w:t xml:space="preserve"> [Partner LOB]</w:t>
+      </w:r>
     </w:p>
     <w:tbl>
       <w:tblPr>
@@ -9196,6 +9580,12 @@
           <w:p>
             <w:r>
               <w:t xml:space="preserve">SAT_LNK_ROLE_PROVIDER</w:t>
+            </w:r>
+            <w:r>
+              <w:rPr>
+                <w:b/>
+              </w:rPr>
+              <w:t xml:space="preserve"> [Partner LOB]</w:t>
             </w:r>
           </w:p>
         </w:tc>
@@ -9459,6 +9849,12 @@
       <w:r>
         <w:t xml:space="preserve">18. OPUS — SAT_LNK_ROLE_SURVEYOR</w:t>
       </w:r>
+      <w:r>
+        <w:rPr>
+          <w:b/>
+        </w:rPr>
+        <w:t xml:space="preserve"> [Partner LOB]</w:t>
+      </w:r>
     </w:p>
     <w:tbl>
       <w:tblPr>
@@ -9516,6 +9912,12 @@
           <w:p>
             <w:r>
               <w:t xml:space="preserve">SAT_LNK_ROLE_SURVEYOR</w:t>
+            </w:r>
+            <w:r>
+              <w:rPr>
+                <w:b/>
+              </w:rPr>
+              <w:t xml:space="preserve"> [Partner LOB]</w:t>
             </w:r>
           </w:p>
         </w:tc>
@@ -9779,6 +10181,12 @@
       <w:r>
         <w:t xml:space="preserve">19. OPUS — SAT_PARTY_AML_SCREENING</w:t>
       </w:r>
+      <w:r>
+        <w:rPr>
+          <w:b/>
+        </w:rPr>
+        <w:t xml:space="preserve"> [Partner LOB]</w:t>
+      </w:r>
     </w:p>
     <w:tbl>
       <w:tblPr>
@@ -9836,6 +10244,12 @@
           <w:p>
             <w:r>
               <w:t xml:space="preserve">SAT_PARTY_AML_SCREENING</w:t>
+            </w:r>
+            <w:r>
+              <w:rPr>
+                <w:b/>
+              </w:rPr>
+              <w:t xml:space="preserve"> [Partner LOB]</w:t>
             </w:r>
           </w:p>
         </w:tc>
@@ -10099,6 +10513,12 @@
       <w:r>
         <w:t xml:space="preserve">20. OPUS — SAT_PARTY_BANKING</w:t>
       </w:r>
+      <w:r>
+        <w:rPr>
+          <w:b/>
+        </w:rPr>
+        <w:t xml:space="preserve"> [Partner LOB]</w:t>
+      </w:r>
     </w:p>
     <w:tbl>
       <w:tblPr>
@@ -10156,6 +10576,12 @@
           <w:p>
             <w:r>
               <w:t xml:space="preserve">SAT_PARTY_BANKING</w:t>
+            </w:r>
+            <w:r>
+              <w:rPr>
+                <w:b/>
+              </w:rPr>
+              <w:t xml:space="preserve"> [Partner LOB]</w:t>
             </w:r>
           </w:p>
         </w:tc>
@@ -10739,6 +11165,12 @@
       <w:r>
         <w:t xml:space="preserve">22. OPUS — SAT_PARTY_CONTACT_ADDRESS_LINK</w:t>
       </w:r>
+      <w:r>
+        <w:rPr>
+          <w:b/>
+        </w:rPr>
+        <w:t xml:space="preserve"> [Partner LOB]</w:t>
+      </w:r>
     </w:p>
     <w:tbl>
       <w:tblPr>
@@ -10796,6 +11228,12 @@
           <w:p>
             <w:r>
               <w:t xml:space="preserve">SAT_PARTY_CONTACT_ADDRESS_LINK</w:t>
+            </w:r>
+            <w:r>
+              <w:rPr>
+                <w:b/>
+              </w:rPr>
+              <w:t xml:space="preserve"> [Partner LOB]</w:t>
             </w:r>
           </w:p>
         </w:tc>
@@ -11051,6 +11489,12 @@
       <w:r>
         <w:t xml:space="preserve">23. OPUS — SAT_PARTY_EMPLOYMENT</w:t>
       </w:r>
+      <w:r>
+        <w:rPr>
+          <w:b/>
+        </w:rPr>
+        <w:t xml:space="preserve"> [Partner LOB]</w:t>
+      </w:r>
     </w:p>
     <w:tbl>
       <w:tblPr>
@@ -11108,6 +11552,12 @@
           <w:p>
             <w:r>
               <w:t xml:space="preserve">SAT_PARTY_EMPLOYMENT</w:t>
+            </w:r>
+            <w:r>
+              <w:rPr>
+                <w:b/>
+              </w:rPr>
+              <w:t xml:space="preserve"> [Partner LOB]</w:t>
             </w:r>
           </w:p>
         </w:tc>
@@ -11371,6 +11821,12 @@
       <w:r>
         <w:t xml:space="preserve">24. OPUS — SAT_PARTY_GROUP_CENSUS</w:t>
       </w:r>
+      <w:r>
+        <w:rPr>
+          <w:b/>
+        </w:rPr>
+        <w:t xml:space="preserve"> [Partner LOB]</w:t>
+      </w:r>
     </w:p>
     <w:tbl>
       <w:tblPr>
@@ -11428,6 +11884,12 @@
           <w:p>
             <w:r>
               <w:t xml:space="preserve">SAT_PARTY_GROUP_CENSUS</w:t>
+            </w:r>
+            <w:r>
+              <w:rPr>
+                <w:b/>
+              </w:rPr>
+              <w:t xml:space="preserve"> [Partner LOB]</w:t>
             </w:r>
           </w:p>
         </w:tc>
@@ -11691,6 +12153,12 @@
       <w:r>
         <w:t xml:space="preserve">25. OPUS — SAT_PARTY_GROUP_HOUSEHOLD</w:t>
       </w:r>
+      <w:r>
+        <w:rPr>
+          <w:b/>
+        </w:rPr>
+        <w:t xml:space="preserve"> [Partner LOB]</w:t>
+      </w:r>
     </w:p>
     <w:tbl>
       <w:tblPr>
@@ -11748,6 +12216,12 @@
           <w:p>
             <w:r>
               <w:t xml:space="preserve">SAT_PARTY_GROUP_HOUSEHOLD</w:t>
+            </w:r>
+            <w:r>
+              <w:rPr>
+                <w:b/>
+              </w:rPr>
+              <w:t xml:space="preserve"> [Partner LOB]</w:t>
             </w:r>
           </w:p>
         </w:tc>
@@ -12011,6 +12485,12 @@
       <w:r>
         <w:t xml:space="preserve">26. OPUS — SAT_PARTY_HEALTH_PROFILE</w:t>
       </w:r>
+      <w:r>
+        <w:rPr>
+          <w:b/>
+        </w:rPr>
+        <w:t xml:space="preserve"> [Partner LOB]</w:t>
+      </w:r>
     </w:p>
     <w:tbl>
       <w:tblPr>
@@ -12068,6 +12548,12 @@
           <w:p>
             <w:r>
               <w:t xml:space="preserve">SAT_PARTY_HEALTH_PROFILE</w:t>
+            </w:r>
+            <w:r>
+              <w:rPr>
+                <w:b/>
+              </w:rPr>
+              <w:t xml:space="preserve"> [Partner LOB]</w:t>
             </w:r>
           </w:p>
         </w:tc>
@@ -12331,6 +12817,12 @@
       <w:r>
         <w:t xml:space="preserve">27. OPUS — SAT_PARTY_IDENTIFICATION</w:t>
       </w:r>
+      <w:r>
+        <w:rPr>
+          <w:b/>
+        </w:rPr>
+        <w:t xml:space="preserve"> [Partner LOB]</w:t>
+      </w:r>
     </w:p>
     <w:tbl>
       <w:tblPr>
@@ -12388,6 +12880,12 @@
           <w:p>
             <w:r>
               <w:t xml:space="preserve">SAT_PARTY_IDENTIFICATION</w:t>
+            </w:r>
+            <w:r>
+              <w:rPr>
+                <w:b/>
+              </w:rPr>
+              <w:t xml:space="preserve"> [Partner LOB]</w:t>
             </w:r>
           </w:p>
         </w:tc>
@@ -12651,6 +13149,12 @@
       <w:r>
         <w:t xml:space="preserve">28. OPUS — SAT_PARTY_IDENTITY</w:t>
       </w:r>
+      <w:r>
+        <w:rPr>
+          <w:b/>
+        </w:rPr>
+        <w:t xml:space="preserve"> [Partner LOB]</w:t>
+      </w:r>
     </w:p>
     <w:tbl>
       <w:tblPr>
@@ -12708,6 +13212,12 @@
           <w:p>
             <w:r>
               <w:t xml:space="preserve">SAT_PARTY_IDENTITY</w:t>
+            </w:r>
+            <w:r>
+              <w:rPr>
+                <w:b/>
+              </w:rPr>
+              <w:t xml:space="preserve"> [Partner LOB]</w:t>
             </w:r>
           </w:p>
         </w:tc>
@@ -12971,6 +13481,12 @@
       <w:r>
         <w:t xml:space="preserve">29. OPUS — SAT_PARTY_INDIVIDUAL_DEMOGRAPHICS</w:t>
       </w:r>
+      <w:r>
+        <w:rPr>
+          <w:b/>
+        </w:rPr>
+        <w:t xml:space="preserve"> [Partner LOB]</w:t>
+      </w:r>
     </w:p>
     <w:tbl>
       <w:tblPr>
@@ -13028,6 +13544,12 @@
           <w:p>
             <w:r>
               <w:t xml:space="preserve">SAT_PARTY_INDIVIDUAL_DEMOGRAPHICS</w:t>
+            </w:r>
+            <w:r>
+              <w:rPr>
+                <w:b/>
+              </w:rPr>
+              <w:t xml:space="preserve"> [Partner LOB]</w:t>
             </w:r>
           </w:p>
         </w:tc>
@@ -13291,6 +13813,12 @@
       <w:r>
         <w:t xml:space="preserve">30. OPUS — SAT_PARTY_KYC</w:t>
       </w:r>
+      <w:r>
+        <w:rPr>
+          <w:b/>
+        </w:rPr>
+        <w:t xml:space="preserve"> [Partner LOB]</w:t>
+      </w:r>
     </w:p>
     <w:tbl>
       <w:tblPr>
@@ -13348,6 +13876,12 @@
           <w:p>
             <w:r>
               <w:t xml:space="preserve">SAT_PARTY_KYC</w:t>
+            </w:r>
+            <w:r>
+              <w:rPr>
+                <w:b/>
+              </w:rPr>
+              <w:t xml:space="preserve"> [Partner LOB]</w:t>
             </w:r>
           </w:p>
         </w:tc>
@@ -13611,6 +14145,12 @@
       <w:r>
         <w:t xml:space="preserve">31. OPUS — SAT_PARTY_KYC_REFERENCE</w:t>
       </w:r>
+      <w:r>
+        <w:rPr>
+          <w:b/>
+        </w:rPr>
+        <w:t xml:space="preserve"> [Partner LOB]</w:t>
+      </w:r>
     </w:p>
     <w:tbl>
       <w:tblPr>
@@ -13668,6 +14208,12 @@
           <w:p>
             <w:r>
               <w:t xml:space="preserve">SAT_PARTY_KYC_REFERENCE</w:t>
+            </w:r>
+            <w:r>
+              <w:rPr>
+                <w:b/>
+              </w:rPr>
+              <w:t xml:space="preserve"> [Partner LOB]</w:t>
             </w:r>
           </w:p>
         </w:tc>
@@ -13931,6 +14477,12 @@
       <w:r>
         <w:t xml:space="preserve">32. OPUS — SAT_PARTY_ORGANISATION_PROFILE</w:t>
       </w:r>
+      <w:r>
+        <w:rPr>
+          <w:b/>
+        </w:rPr>
+        <w:t xml:space="preserve"> [Partner LOB]</w:t>
+      </w:r>
     </w:p>
     <w:tbl>
       <w:tblPr>
@@ -13988,6 +14540,12 @@
           <w:p>
             <w:r>
               <w:t xml:space="preserve">SAT_PARTY_ORGANISATION_PROFILE</w:t>
+            </w:r>
+            <w:r>
+              <w:rPr>
+                <w:b/>
+              </w:rPr>
+              <w:t xml:space="preserve"> [Partner LOB]</w:t>
             </w:r>
           </w:p>
         </w:tc>
@@ -15211,6 +15769,12 @@
       <w:r>
         <w:t xml:space="preserve">36. OPUS — SAT_POLICY_CLASSIFICATION</w:t>
       </w:r>
+      <w:r>
+        <w:rPr>
+          <w:b/>
+        </w:rPr>
+        <w:t xml:space="preserve"> [Partner LOB]</w:t>
+      </w:r>
     </w:p>
     <w:tbl>
       <w:tblPr>
@@ -15268,6 +15832,12 @@
           <w:p>
             <w:r>
               <w:t xml:space="preserve">SAT_POLICY_CLASSIFICATION</w:t>
+            </w:r>
+            <w:r>
+              <w:rPr>
+                <w:b/>
+              </w:rPr>
+              <w:t xml:space="preserve"> [Partner LOB]</w:t>
             </w:r>
           </w:p>
         </w:tc>
@@ -16163,6 +16733,12 @@
       <w:r>
         <w:t xml:space="preserve">39. OPUS — SAT_POLICY_HEADER</w:t>
       </w:r>
+      <w:r>
+        <w:rPr>
+          <w:b/>
+        </w:rPr>
+        <w:t xml:space="preserve"> [Partner LOB]</w:t>
+      </w:r>
     </w:p>
     <w:tbl>
       <w:tblPr>
@@ -16220,6 +16796,12 @@
           <w:p>
             <w:r>
               <w:t xml:space="preserve">SAT_POLICY_HEADER</w:t>
+            </w:r>
+            <w:r>
+              <w:rPr>
+                <w:b/>
+              </w:rPr>
+              <w:t xml:space="preserve"> [Partner LOB]</w:t>
             </w:r>
           </w:p>
         </w:tc>
@@ -16803,6 +17385,12 @@
       <w:r>
         <w:t xml:space="preserve">41. OPUS — SAT_POLICY_PREMIUM_SUMMARY</w:t>
       </w:r>
+      <w:r>
+        <w:rPr>
+          <w:b/>
+        </w:rPr>
+        <w:t xml:space="preserve"> [Partner LOB]</w:t>
+      </w:r>
     </w:p>
     <w:tbl>
       <w:tblPr>
@@ -16860,6 +17448,12 @@
           <w:p>
             <w:r>
               <w:t xml:space="preserve">SAT_POLICY_PREMIUM_SUMMARY</w:t>
+            </w:r>
+            <w:r>
+              <w:rPr>
+                <w:b/>
+              </w:rPr>
+              <w:t xml:space="preserve"> [Partner LOB]</w:t>
             </w:r>
           </w:p>
         </w:tc>
@@ -17443,6 +18037,12 @@
       <w:r>
         <w:t xml:space="preserve">43. OPUS — SAT_PROVIDER_BANKING</w:t>
       </w:r>
+      <w:r>
+        <w:rPr>
+          <w:b/>
+        </w:rPr>
+        <w:t xml:space="preserve"> [Partner LOB]</w:t>
+      </w:r>
     </w:p>
     <w:tbl>
       <w:tblPr>
@@ -17500,6 +18100,12 @@
           <w:p>
             <w:r>
               <w:t xml:space="preserve">SAT_PROVIDER_BANKING</w:t>
+            </w:r>
+            <w:r>
+              <w:rPr>
+                <w:b/>
+              </w:rPr>
+              <w:t xml:space="preserve"> [Partner LOB]</w:t>
             </w:r>
           </w:p>
         </w:tc>
@@ -17763,6 +18369,12 @@
       <w:r>
         <w:t xml:space="preserve">44. OPUS — SAT_PROVIDER_TARIFF</w:t>
       </w:r>
+      <w:r>
+        <w:rPr>
+          <w:b/>
+        </w:rPr>
+        <w:t xml:space="preserve"> [Partner LOB]</w:t>
+      </w:r>
     </w:p>
     <w:tbl>
       <w:tblPr>
@@ -17820,6 +18432,12 @@
           <w:p>
             <w:r>
               <w:t xml:space="preserve">SAT_PROVIDER_TARIFF</w:t>
+            </w:r>
+            <w:r>
+              <w:rPr>
+                <w:b/>
+              </w:rPr>
+              <w:t xml:space="preserve"> [Partner LOB]</w:t>
             </w:r>
           </w:p>
         </w:tc>
@@ -20643,6 +21261,12 @@
       <w:r>
         <w:t xml:space="preserve">53. OPUS — SAT_AUG_LNK_ROLE_AGENT</w:t>
       </w:r>
+      <w:r>
+        <w:rPr>
+          <w:b/>
+        </w:rPr>
+        <w:t xml:space="preserve"> [Partner LOB]</w:t>
+      </w:r>
     </w:p>
     <w:tbl>
       <w:tblPr>
@@ -20700,6 +21324,12 @@
           <w:p>
             <w:r>
               <w:t xml:space="preserve">SAT_AUG_LNK_ROLE_AGENT</w:t>
+            </w:r>
+            <w:r>
+              <w:rPr>
+                <w:b/>
+              </w:rPr>
+              <w:t xml:space="preserve"> [Partner LOB]</w:t>
             </w:r>
           </w:p>
         </w:tc>
@@ -20963,6 +21593,12 @@
       <w:r>
         <w:t xml:space="preserve">54. OPUS — SAT_AUG_LNK_ROLE_CUSTOMER</w:t>
       </w:r>
+      <w:r>
+        <w:rPr>
+          <w:b/>
+        </w:rPr>
+        <w:t xml:space="preserve"> [Partner LOB]</w:t>
+      </w:r>
     </w:p>
     <w:tbl>
       <w:tblPr>
@@ -21020,6 +21656,12 @@
           <w:p>
             <w:r>
               <w:t xml:space="preserve">SAT_AUG_LNK_ROLE_CUSTOMER</w:t>
+            </w:r>
+            <w:r>
+              <w:rPr>
+                <w:b/>
+              </w:rPr>
+              <w:t xml:space="preserve"> [Partner LOB]</w:t>
             </w:r>
           </w:p>
         </w:tc>
@@ -21283,6 +21925,12 @@
       <w:r>
         <w:t xml:space="preserve">55. OPUS — SAT_AUG_LNK_ROLE_PROVIDER</w:t>
       </w:r>
+      <w:r>
+        <w:rPr>
+          <w:b/>
+        </w:rPr>
+        <w:t xml:space="preserve"> [Partner LOB]</w:t>
+      </w:r>
     </w:p>
     <w:tbl>
       <w:tblPr>
@@ -21340,6 +21988,12 @@
           <w:p>
             <w:r>
               <w:t xml:space="preserve">SAT_AUG_LNK_ROLE_PROVIDER</w:t>
+            </w:r>
+            <w:r>
+              <w:rPr>
+                <w:b/>
+              </w:rPr>
+              <w:t xml:space="preserve"> [Partner LOB]</w:t>
             </w:r>
           </w:p>
         </w:tc>
@@ -21603,6 +22257,12 @@
       <w:r>
         <w:t xml:space="preserve">56. OPUS — SAT_AUG_LNK_ROLE_SURVEYOR</w:t>
       </w:r>
+      <w:r>
+        <w:rPr>
+          <w:b/>
+        </w:rPr>
+        <w:t xml:space="preserve"> [Partner LOB]</w:t>
+      </w:r>
     </w:p>
     <w:tbl>
       <w:tblPr>
@@ -21660,6 +22320,12 @@
           <w:p>
             <w:r>
               <w:t xml:space="preserve">SAT_AUG_LNK_ROLE_SURVEYOR</w:t>
+            </w:r>
+            <w:r>
+              <w:rPr>
+                <w:b/>
+              </w:rPr>
+              <w:t xml:space="preserve"> [Partner LOB]</w:t>
             </w:r>
           </w:p>
         </w:tc>

</xml_diff>

<commit_message>
DM-H2 OPUS: SAT_AUG_LOCATION result + remarks
</commit_message>
<xml_diff>
--- a/BGIL_DBT/validation/DM-H/DM-H2_OPUS.docx
+++ b/BGIL_DBT/validation/DM-H/DM-H2_OPUS.docx
@@ -14725,7 +14725,11 @@
           <w:tcPr>
             <w:tcW w:w="5640" w:type="dxa"/>
           </w:tcPr>
-          <w:p/>
+          <w:p>
+            <w:r>
+              <w:t xml:space="preserve">FAIL(DUE TO SOURCE GRAIN)</w:t>
+            </w:r>
+          </w:p>
         </w:tc>
       </w:tr>
       <w:tr>
@@ -14746,7 +14750,11 @@
           <w:tcPr>
             <w:tcW w:w="5640" w:type="dxa"/>
           </w:tcPr>
-          <w:p/>
+          <w:p>
+            <w:r>
+              <w:t xml:space="preserve">44</w:t>
+            </w:r>
+          </w:p>
         </w:tc>
       </w:tr>
       <w:tr>
@@ -14767,7 +14775,11 @@
           <w:tcPr>
             <w:tcW w:w="5640" w:type="dxa"/>
           </w:tcPr>
-          <w:p/>
+          <w:p>
+            <w:r>
+              <w:t xml:space="preserve">FAIL – Source grain issue. CP_PARTNERS has many partners per add_id, so CARE_OF_NAME (from addressee) is many-per-location while the satellite stores it as one-per-location. 37,056 key/load-time groups in OPUS_CP_PARTNERS have more than one row (201,836 rows; max 11,532 rows for one key at one load time). sat_multi_source dedupes by LAG(HASHDIFF) ordered only by LOAD_DATETIME, so tied rows interleave and duplicates are kept (example key 5E2B9D0E14034E25964EDE2A1044669C: 35 CP_PARTNERS rows at 2026-08-24 18:42:07.024 across 4 addressees, several identical). HASHDIFF calculation itself is correct (DM-H1 (a) PASS). Needs modeler/mapper decision: make it multi-active by partner, move CARE_OF_NAME to a party satellite, or dedupe in the stage.</w:t>
+            </w:r>
+          </w:p>
         </w:tc>
       </w:tr>
     </w:tbl>

</xml_diff>